<commit_message>
fix email sending configuration
</commit_message>
<xml_diff>
--- a/templates/Template_word.docx
+++ b/templates/Template_word.docx
@@ -261,7 +261,7 @@
           <w:rFonts w:cs="Arial"/>
           <w:sz w:val="24"/>
           <w:szCs w:val="24"/>
-          <w:lang w:val="ru-RU"/>
+          <w:lang w:val="en-US"/>
         </w:rPr>
       </w:pPr>
     </w:p>
@@ -289,7 +289,6 @@
           <w:p>
             <w:pPr>
               <w:ind w:left="0"/>
-              <w:jc w:val="center"/>
               <w:rPr>
                 <w:rFonts w:cs="Arial"/>
                 <w:b/>
@@ -306,8 +305,62 @@
                 <w:bCs/>
                 <w:sz w:val="28"/>
                 <w:szCs w:val="28"/>
+                <w:lang w:val="ru-RU"/>
               </w:rPr>
-              <w:t>{{GREETING_WORD}} {{GREETING_NAME}},</w:t>
+              <w:t xml:space="preserve">           </w:t>
+            </w:r>
+            <w:r>
+              <w:rPr>
+                <w:rFonts w:cs="Arial"/>
+                <w:b/>
+                <w:bCs/>
+                <w:sz w:val="28"/>
+                <w:szCs w:val="28"/>
+                <w:lang w:val="ru-RU"/>
+              </w:rPr>
+              <w:t xml:space="preserve">     </w:t>
+            </w:r>
+            <w:r>
+              <w:rPr>
+                <w:rFonts w:cs="Arial"/>
+                <w:b/>
+                <w:bCs/>
+                <w:sz w:val="28"/>
+                <w:szCs w:val="28"/>
+                <w:lang w:val="ru-RU"/>
+              </w:rPr>
+              <w:t xml:space="preserve"> </w:t>
+            </w:r>
+            <w:r>
+              <w:rPr>
+                <w:rFonts w:cs="Arial"/>
+                <w:b/>
+                <w:bCs/>
+                <w:sz w:val="28"/>
+                <w:szCs w:val="28"/>
+                <w:lang w:val="ru-RU"/>
+              </w:rPr>
+              <w:t xml:space="preserve">     </w:t>
+            </w:r>
+            <w:r>
+              <w:rPr>
+                <w:rFonts w:cs="Arial"/>
+                <w:b/>
+                <w:bCs/>
+                <w:sz w:val="28"/>
+                <w:szCs w:val="28"/>
+              </w:rPr>
+              <w:t>{{GREETING_WORD}} {{GREETING_NAME}}</w:t>
+            </w:r>
+            <w:r>
+              <w:rPr>
+                <w:rFonts w:cs="Arial"/>
+                <w:b/>
+                <w:bCs/>
+                <w:sz w:val="28"/>
+                <w:szCs w:val="28"/>
+              </w:rPr>
+              <w:t>,</w:t>
             </w:r>
           </w:p>
         </w:tc>
@@ -2091,7 +2144,7 @@
         </mc:Choice>
         <mc:Fallback>
           <w:pict>
-            <v:line w14:anchorId="0B472FFD" id="Line 1" o:spid="_x0000_s1026" style="position:absolute;z-index:251654144;visibility:visible;mso-wrap-style:square;mso-width-percent:0;mso-height-percent:0;mso-wrap-distance-left:9pt;mso-wrap-distance-top:-3e-5mm;mso-wrap-distance-right:9pt;mso-wrap-distance-bottom:-3e-5mm;mso-position-horizontal:absolute;mso-position-horizontal-relative:text;mso-position-vertical:absolute;mso-position-vertical-relative:text;mso-width-percent:0;mso-height-percent:0;mso-width-relative:page;mso-height-relative:page" from="0,.3pt" to="528.5pt,.3pt" o:gfxdata="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" strokeweight=".26mm"/>
+            <v:line w14:anchorId="7C3CFF98" id="Line 1" o:spid="_x0000_s1026" style="position:absolute;z-index:251654144;visibility:visible;mso-wrap-style:square;mso-width-percent:0;mso-height-percent:0;mso-wrap-distance-left:9pt;mso-wrap-distance-top:-3e-5mm;mso-wrap-distance-right:9pt;mso-wrap-distance-bottom:-3e-5mm;mso-position-horizontal:absolute;mso-position-horizontal-relative:text;mso-position-vertical:absolute;mso-position-vertical-relative:text;mso-width-percent:0;mso-height-percent:0;mso-width-relative:page;mso-height-relative:page" from="0,.3pt" to="528.5pt,.3pt" o:gfxdata="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" strokeweight=".26mm"/>
           </w:pict>
         </mc:Fallback>
       </mc:AlternateContent>
@@ -3154,7 +3207,7 @@
         </mc:Choice>
         <mc:Fallback>
           <w:pict>
-            <v:line w14:anchorId="3275E4CD" id="Line 2" o:spid="_x0000_s1026" style="position:absolute;z-index:251656192;visibility:visible;mso-wrap-style:square;mso-width-percent:0;mso-height-percent:0;mso-wrap-distance-left:9pt;mso-wrap-distance-top:-3e-5mm;mso-wrap-distance-right:9pt;mso-wrap-distance-bottom:-3e-5mm;mso-position-horizontal:absolute;mso-position-horizontal-relative:text;mso-position-vertical:absolute;mso-position-vertical-relative:text;mso-width-percent:0;mso-height-percent:0;mso-width-relative:page;mso-height-relative:page" from="0,-.15pt" to="528.5pt,-.15pt" o:gfxdata="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" strokeweight=".26mm"/>
+            <v:line w14:anchorId="348F9DA5" id="Line 2" o:spid="_x0000_s1026" style="position:absolute;z-index:251656192;visibility:visible;mso-wrap-style:square;mso-width-percent:0;mso-height-percent:0;mso-wrap-distance-left:9pt;mso-wrap-distance-top:-3e-5mm;mso-wrap-distance-right:9pt;mso-wrap-distance-bottom:-3e-5mm;mso-position-horizontal:absolute;mso-position-horizontal-relative:text;mso-position-vertical:absolute;mso-position-vertical-relative:text;mso-width-percent:0;mso-height-percent:0;mso-width-relative:page;mso-height-relative:page" from="0,-.15pt" to="528.5pt,-.15pt" o:gfxdata="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" strokeweight=".26mm"/>
           </w:pict>
         </mc:Fallback>
       </mc:AlternateContent>
@@ -3272,7 +3325,7 @@
         <w:noProof/>
         <w:lang w:val="en-GB"/>
       </w:rPr>
-      <w:t>02/06/26</w:t>
+      <w:t>17/06/26</w:t>
     </w:r>
     <w:r>
       <w:rPr>

</xml_diff>

<commit_message>
version 1 Turkmenistan send
</commit_message>
<xml_diff>
--- a/templates/Template_word.docx
+++ b/templates/Template_word.docx
@@ -29,7 +29,15 @@
           <w:sz w:val="24"/>
           <w:szCs w:val="24"/>
         </w:rPr>
-        <w:t>Исх № {{OUT_NUMBER}} от {{DATE}}.</w:t>
+        <w:t xml:space="preserve">Исх № {{OUT_NUMBER}} от </w:t>
+      </w:r>
+      <w:r>
+        <w:rPr>
+          <w:rFonts w:ascii="Times New Roman" w:hAnsi="Times New Roman"/>
+          <w:sz w:val="24"/>
+          <w:szCs w:val="24"/>
+        </w:rPr>
+        <w:t>{{TODAY}}.</w:t>
       </w:r>
       <w:r>
         <w:rPr>
@@ -305,7 +313,7 @@
                 <w:bCs/>
                 <w:sz w:val="28"/>
                 <w:szCs w:val="28"/>
-                <w:lang w:val="ru-RU"/>
+                <w:lang w:val="en-US"/>
               </w:rPr>
               <w:t xml:space="preserve">           </w:t>
             </w:r>
@@ -316,7 +324,7 @@
                 <w:bCs/>
                 <w:sz w:val="28"/>
                 <w:szCs w:val="28"/>
-                <w:lang w:val="ru-RU"/>
+                <w:lang w:val="en-US"/>
               </w:rPr>
               <w:t xml:space="preserve">     </w:t>
             </w:r>
@@ -327,7 +335,7 @@
                 <w:bCs/>
                 <w:sz w:val="28"/>
                 <w:szCs w:val="28"/>
-                <w:lang w:val="ru-RU"/>
+                <w:lang w:val="en-US"/>
               </w:rPr>
               <w:t xml:space="preserve"> </w:t>
             </w:r>
@@ -338,7 +346,7 @@
                 <w:bCs/>
                 <w:sz w:val="28"/>
                 <w:szCs w:val="28"/>
-                <w:lang w:val="ru-RU"/>
+                <w:lang w:val="en-US"/>
               </w:rPr>
               <w:t xml:space="preserve">     </w:t>
             </w:r>
@@ -1591,6 +1599,7 @@
         </w:rPr>
         <w:t xml:space="preserve">   </w:t>
       </w:r>
+      <w:proofErr w:type="spellStart"/>
       <w:r>
         <w:rPr>
           <w:rFonts w:cs="Arial"/>
@@ -1599,7 +1608,18 @@
           <w:szCs w:val="24"/>
           <w:lang w:val="ru-RU"/>
         </w:rPr>
-        <w:t>Урумбаев С.А.</w:t>
+        <w:t>Урумбаев</w:t>
+      </w:r>
+      <w:proofErr w:type="spellEnd"/>
+      <w:r>
+        <w:rPr>
+          <w:rFonts w:cs="Arial"/>
+          <w:b/>
+          <w:sz w:val="24"/>
+          <w:szCs w:val="24"/>
+          <w:lang w:val="ru-RU"/>
+        </w:rPr>
+        <w:t xml:space="preserve"> С.А.</w:t>
       </w:r>
       <w:r>
         <w:rPr>
@@ -2144,7 +2164,7 @@
         </mc:Choice>
         <mc:Fallback>
           <w:pict>
-            <v:line w14:anchorId="7C3CFF98" id="Line 1" o:spid="_x0000_s1026" style="position:absolute;z-index:251654144;visibility:visible;mso-wrap-style:square;mso-width-percent:0;mso-height-percent:0;mso-wrap-distance-left:9pt;mso-wrap-distance-top:-3e-5mm;mso-wrap-distance-right:9pt;mso-wrap-distance-bottom:-3e-5mm;mso-position-horizontal:absolute;mso-position-horizontal-relative:text;mso-position-vertical:absolute;mso-position-vertical-relative:text;mso-width-percent:0;mso-height-percent:0;mso-width-relative:page;mso-height-relative:page" from="0,.3pt" to="528.5pt,.3pt" o:gfxdata="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" strokeweight=".26mm"/>
+            <v:line w14:anchorId="6796E739" id="Line 1" o:spid="_x0000_s1026" style="position:absolute;z-index:251654144;visibility:visible;mso-wrap-style:square;mso-width-percent:0;mso-height-percent:0;mso-wrap-distance-left:9pt;mso-wrap-distance-top:-3e-5mm;mso-wrap-distance-right:9pt;mso-wrap-distance-bottom:-3e-5mm;mso-position-horizontal:absolute;mso-position-horizontal-relative:text;mso-position-vertical:absolute;mso-position-vertical-relative:text;mso-width-percent:0;mso-height-percent:0;mso-width-relative:page;mso-height-relative:page" from="0,.3pt" to="528.5pt,.3pt" o:gfxdata="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" strokeweight=".26mm"/>
           </w:pict>
         </mc:Fallback>
       </mc:AlternateContent>
@@ -2582,6 +2602,7 @@
                             </w:rPr>
                             <w:t>ТОО «</w:t>
                           </w:r>
+                          <w:proofErr w:type="spellStart"/>
                           <w:r>
                             <w:rPr>
                               <w:b/>
@@ -2591,6 +2612,7 @@
                             </w:rPr>
                             <w:t>RenSer</w:t>
                           </w:r>
+                          <w:proofErr w:type="spellEnd"/>
                           <w:r>
                             <w:rPr>
                               <w:b/>
@@ -2675,6 +2697,7 @@
                       </w:rPr>
                       <w:t>ТОО «</w:t>
                     </w:r>
+                    <w:proofErr w:type="spellStart"/>
                     <w:r>
                       <w:rPr>
                         <w:b/>
@@ -2684,6 +2707,7 @@
                       </w:rPr>
                       <w:t>RenSer</w:t>
                     </w:r>
+                    <w:proofErr w:type="spellEnd"/>
                     <w:r>
                       <w:rPr>
                         <w:b/>
@@ -3207,7 +3231,7 @@
         </mc:Choice>
         <mc:Fallback>
           <w:pict>
-            <v:line w14:anchorId="348F9DA5" id="Line 2" o:spid="_x0000_s1026" style="position:absolute;z-index:251656192;visibility:visible;mso-wrap-style:square;mso-width-percent:0;mso-height-percent:0;mso-wrap-distance-left:9pt;mso-wrap-distance-top:-3e-5mm;mso-wrap-distance-right:9pt;mso-wrap-distance-bottom:-3e-5mm;mso-position-horizontal:absolute;mso-position-horizontal-relative:text;mso-position-vertical:absolute;mso-position-vertical-relative:text;mso-width-percent:0;mso-height-percent:0;mso-width-relative:page;mso-height-relative:page" from="0,-.15pt" to="528.5pt,-.15pt" o:gfxdata="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" strokeweight=".26mm"/>
+            <v:line w14:anchorId="7DFD316A" id="Line 2" o:spid="_x0000_s1026" style="position:absolute;z-index:251656192;visibility:visible;mso-wrap-style:square;mso-width-percent:0;mso-height-percent:0;mso-wrap-distance-left:9pt;mso-wrap-distance-top:-3e-5mm;mso-wrap-distance-right:9pt;mso-wrap-distance-bottom:-3e-5mm;mso-position-horizontal:absolute;mso-position-horizontal-relative:text;mso-position-vertical:absolute;mso-position-vertical-relative:text;mso-width-percent:0;mso-height-percent:0;mso-width-relative:page;mso-height-relative:page" from="0,-.15pt" to="528.5pt,-.15pt" o:gfxdata="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" strokeweight=".26mm"/>
           </w:pict>
         </mc:Fallback>
       </mc:AlternateContent>
@@ -3325,7 +3349,7 @@
         <w:noProof/>
         <w:lang w:val="en-GB"/>
       </w:rPr>
-      <w:t>17/06/26</w:t>
+      <w:t>24/06/26</w:t>
     </w:r>
     <w:r>
       <w:rPr>

</xml_diff>